<commit_message>
Integrate L4 freshness binding, refine taxonomy paper, and include cross-stack comparison
</commit_message>
<xml_diff>
--- a/thesis/cognitive_hypervisor_thesis.docx
+++ b/thesis/cognitive_hypervisor_thesis.docx
@@ -6,13 +6,16 @@
       <w:pPr>
         <w:keepNext/>
         <w:spacing w:before="360" w:after="240"/>
+        <w:pBdr>
+          <w:bottom w:val="single" w:sz="12" w:space="6" w:color="8ECAE6"/>
+        </w:pBdr>
       </w:pPr>
       <w:r>
         <w:rPr>
           <w:rFonts w:ascii="Segoe UI" w:hAnsi="Segoe UI"/>
           <w:b/>
           <w:i w:val="0"/>
-          <w:color w:val="4F46E5"/>
+          <w:color w:val="0C1117"/>
           <w:sz w:val="36"/>
         </w:rPr>
         <w:t>The Cognitive Hypervisor: Architecture for Portable, Persistent AI Agency</w:t>
@@ -153,7 +156,7 @@
           <w:rFonts w:ascii="Segoe UI" w:hAnsi="Segoe UI"/>
           <w:b/>
           <w:i w:val="0"/>
-          <w:color w:val="475569"/>
+          <w:color w:val="0C1117"/>
           <w:sz w:val="28"/>
         </w:rPr>
         <w:t>00. Abstract</w:t>
@@ -277,7 +280,7 @@
           <w:rFonts w:ascii="Segoe UI" w:hAnsi="Segoe UI"/>
           <w:b/>
           <w:i w:val="0"/>
-          <w:color w:val="475569"/>
+          <w:color w:val="0C1117"/>
           <w:sz w:val="28"/>
         </w:rPr>
         <w:t>01. Lineage: Virtualization of the Agent Layer</w:t>
@@ -401,7 +404,7 @@
           <w:rFonts w:ascii="Segoe UI" w:hAnsi="Segoe UI"/>
           <w:b/>
           <w:i w:val="0"/>
-          <w:color w:val="475569"/>
+          <w:color w:val="0C1117"/>
           <w:sz w:val="28"/>
         </w:rPr>
         <w:t>02. Structured Plain Text as an Instruction Set Architecture</w:t>
@@ -525,7 +528,7 @@
           <w:rFonts w:ascii="Segoe UI" w:hAnsi="Segoe UI"/>
           <w:b/>
           <w:i w:val="0"/>
-          <w:color w:val="475569"/>
+          <w:color w:val="0C1117"/>
           <w:sz w:val="28"/>
         </w:rPr>
         <w:t>03. Tiered Persistence and State Preservation</w:t>
@@ -649,7 +652,7 @@
           <w:rFonts w:ascii="Segoe UI" w:hAnsi="Segoe UI"/>
           <w:b/>
           <w:i w:val="0"/>
-          <w:color w:val="475569"/>
+          <w:color w:val="0C1117"/>
           <w:sz w:val="28"/>
         </w:rPr>
         <w:t>04. Compute Economics: Cognitive Caching vs. Repeated Inference</w:t>
@@ -914,7 +917,7 @@
           <w:rFonts w:ascii="Segoe UI" w:hAnsi="Segoe UI"/>
           <w:b/>
           <w:i w:val="0"/>
-          <w:color w:val="475569"/>
+          <w:color w:val="0C1117"/>
           <w:sz w:val="28"/>
         </w:rPr>
         <w:t>05. Portable Identity and the Truth Root</w:t>
@@ -1058,7 +1061,7 @@
           <w:rFonts w:ascii="Segoe UI" w:hAnsi="Segoe UI"/>
           <w:b/>
           <w:i w:val="0"/>
-          <w:color w:val="475569"/>
+          <w:color w:val="0C1117"/>
           <w:sz w:val="28"/>
         </w:rPr>
         <w:t>06. Operational Limitations</w:t>
@@ -1152,7 +1155,7 @@
           <w:rFonts w:ascii="Segoe UI" w:hAnsi="Segoe UI"/>
           <w:b/>
           <w:i w:val="0"/>
-          <w:color w:val="475569"/>
+          <w:color w:val="0C1117"/>
           <w:sz w:val="28"/>
         </w:rPr>
         <w:t>07. Conclusion</w:t>

</xml_diff>